<commit_message>
Publish v8 assessment alignment, W5-W6 lessons and portfolio integration
</commit_message>
<xml_diff>
--- a/worksheets/W16_即時回應替代安排單_學生用.docx
+++ b/worksheets/W16_即時回應替代安排單_學生用.docx
@@ -51,7 +51,7 @@
           <w:color w:val="5B6573"/>
           <w:sz w:val="22"/>
         </w:rPr>
-        <w:t>個人事前未知答辯 15 分｜只換場合或媒介；未知性、5 分鐘、材料與禁止工具不變。申請不用說原因。</w:t>
+        <w:t>公共說明與回應｜個人20分。可換場合、媒介或約時間；保留本人實際問題與回應，不必說私人原因。</w:t>
       </w:r>
     </w:p>
     <w:p>
@@ -190,7 +190,7 @@
           <w:color w:val="1A2340"/>
           <w:sz w:val="20"/>
         </w:rPr>
-        <w:t>□ 課後單獨口述　□ 聽完未知問題立即錄音　□ 現場限時書寫　□ 需要與老師另約安靜時段</w:t>
+        <w:t>□ 單獨口述　□ 先整理再錄音　□ 書面回答　□ 與老師另約安靜時段</w:t>
       </w:r>
     </w:p>
     <w:p>
@@ -205,7 +205,7 @@
           <w:color w:val="5B6573"/>
           <w:sz w:val="18"/>
         </w:rPr>
-        <w:t>教師安排：＿＿月＿＿日＿＿時＿＿分　地點／方式：＿＿＿＿＿＿　限時：5 分鐘（核准延時：＿＿）</w:t>
+        <w:t>教師安排：＿＿月＿＿日＿＿時＿＿分　地點／方式：＿＿＿＿＿＿　可用材料：＿＿＿＿　整理與回應時間：＿＿＿＿</w:t>
       </w:r>
     </w:p>
     <w:p>
@@ -242,7 +242,7 @@
           <w:color w:val="1A2340"/>
           <w:sz w:val="30"/>
         </w:rPr>
-        <w:t>問題到現場才給</w:t>
+        <w:t>收到什麼實際問題</w:t>
       </w:r>
     </w:p>
     <w:p>
@@ -279,7 +279,7 @@
           <w:color w:val="1A2340"/>
           <w:sz w:val="22"/>
         </w:rPr>
-        <w:t>教師勾選：□證據 □推論 □價值 □定義　問題原句：</w:t>
+        <w:t>□觀眾實問 □教師支援提問；來源＿＿；問題原話：</w:t>
       </w:r>
     </w:p>
     <w:tbl>
@@ -358,7 +358,7 @@
           <w:color w:val="1A2340"/>
           <w:sz w:val="30"/>
         </w:rPr>
-        <w:t>我的即時回應｜沿用三句型</w:t>
+        <w:t>我的初答與理由</w:t>
       </w:r>
     </w:p>
     <w:p>
@@ -834,7 +834,7 @@
           <w:color w:val="5B6573"/>
           <w:sz w:val="16"/>
         </w:rPr>
-        <w:t>條件｜可看團隊五張與核准來源定位；不用 AI／網路，不討論、不接受組員提示。錄音只供教師判讀，依校規刪除。本單依四項 0–2 換算個人 15 分；重測只用平行、事前未見、同條件新題。</w:t>
+        <w:t>可看材料、先想再答，後續可澄清與補充；本人理由不讓AI或組員代寫。老師合看W13準備、W15真人試讀與本次回應，四項0–3換算20分，不按速度評分。錄音只供教師判讀。</w:t>
       </w:r>
     </w:p>
     <w:sectPr>

</xml_diff>